<commit_message>
feat: Integrate high-res headshot profile photo in Portfolio avatar and CV HTML, plus presentation banner
</commit_message>
<xml_diff>
--- a/KOA_MARIE_GERVAIS_NELLY_CV_EXECUTIVE.docx
+++ b/KOA_MARIE_GERVAIS_NELLY_CV_EXECUTIVE.docx
@@ -34,79 +34,66 @@
                 <w:szCs w:val="20"/>
               </w:rPr>
             </w:pPr>
-          </w:p>
-          <w:tbl>
-            <w:tblPr>
-              <w:tblW w:w="0" w:type="auto"/>
-              <w:jc w:val="center"/>
-              <w:tblLook w:val="04A0" w:firstRow="1" w:lastRow="0" w:firstColumn="1" w:lastColumn="0" w:noHBand="0" w:noVBand="1"/>
-            </w:tblPr>
-            <w:tblGrid>
-              <w:gridCol w:w="2160"/>
-            </w:tblGrid>
-            <w:tr>
-              <w:trPr>
-                <w:jc w:val="center"/>
-              </w:trPr>
-              <w:tc>
-                <w:tcPr>
-                  <w:tcW w:w="2160" w:type="dxa"/>
-                  <w:shd w:val="clear" w:color="auto" w:fill="1E293B"/>
-                  <w:tcMar>
-                    <w:top w:w="100" w:type="dxa"/>
-                    <w:left w:w="60" w:type="dxa"/>
-                    <w:bottom w:w="100" w:type="dxa"/>
-                    <w:right w:w="60" w:type="dxa"/>
-                  </w:tcMar>
-                </w:tcPr>
-                <w:p>
-                  <w:pPr>
-                    <w:spacing w:after="0"/>
-                    <w:jc w:val="center"/>
-                    <w:rPr>
-                      <w:sz w:val="20"/>
-                      <w:szCs w:val="20"/>
-                    </w:rPr>
-                  </w:pPr>
-                  <w:r>
-                    <w:rPr>
-                      <w:b/>
-                      <w:color w:val="38BDF8"/>
-                      <w:sz w:val="20"/>
-                      <w:szCs w:val="20"/>
-                    </w:rPr>
-                    <w:t>📷</w:t>
-                  </w:r>
-                  <w:r>
-                    <w:rPr>
-                      <w:b/>
-                      <w:color w:val="38BDF8"/>
-                      <w:sz w:val="20"/>
-                      <w:szCs w:val="20"/>
-                    </w:rPr>
-                    <w:t xml:space="preserve"> PHOTO CV</w:t>
-                  </w:r>
-                  <w:r>
-                    <w:rPr>
-                      <w:b/>
-                      <w:color w:val="38BDF8"/>
-                      <w:sz w:val="20"/>
-                      <w:szCs w:val="20"/>
-                    </w:rPr>
-                    <w:br/>
-                    <w:t>(Insérer photo)</w:t>
-                  </w:r>
-                </w:p>
-              </w:tc>
-            </w:tr>
-          </w:tbl>
-          <w:p>
-            <w:pPr>
-              <w:rPr>
-                <w:sz w:val="20"/>
-                <w:szCs w:val="20"/>
-              </w:rPr>
-            </w:pPr>
+            <w:bookmarkStart w:id="0" w:name="_GoBack"/>
+            <w:bookmarkEnd w:id="0"/>
+            <w:r>
+              <w:rPr>
+                <w:b/>
+                <w:noProof/>
+                <w:color w:val="38BDF8"/>
+                <w:sz w:val="20"/>
+                <w:szCs w:val="20"/>
+                <w:lang w:val="fr-FR" w:eastAsia="fr-FR"/>
+              </w:rPr>
+              <w:drawing>
+                <wp:inline distT="0" distB="0" distL="0" distR="0" wp14:anchorId="4B4CF01C" wp14:editId="61A43FE8">
+                  <wp:extent cx="1930400" cy="1663700"/>
+                  <wp:effectExtent l="0" t="0" r="0" b="0"/>
+                  <wp:docPr id="1" name="Image 1" descr="C:\Users\HP\Downloads\Man_in_suit_headshot_202607251317.jpeg"/>
+                  <wp:cNvGraphicFramePr>
+                    <a:graphicFrameLocks xmlns:a="http://schemas.openxmlformats.org/drawingml/2006/main" noChangeAspect="1"/>
+                  </wp:cNvGraphicFramePr>
+                  <a:graphic xmlns:a="http://schemas.openxmlformats.org/drawingml/2006/main">
+                    <a:graphicData uri="http://schemas.openxmlformats.org/drawingml/2006/picture">
+                      <pic:pic xmlns:pic="http://schemas.openxmlformats.org/drawingml/2006/picture">
+                        <pic:nvPicPr>
+                          <pic:cNvPr id="0" name="Picture 1" descr="C:\Users\HP\Downloads\Man_in_suit_headshot_202607251317.jpeg"/>
+                          <pic:cNvPicPr>
+                            <a:picLocks noChangeAspect="1" noChangeArrowheads="1"/>
+                          </pic:cNvPicPr>
+                        </pic:nvPicPr>
+                        <pic:blipFill>
+                          <a:blip r:embed="rId6">
+                            <a:extLst>
+                              <a:ext uri="{28A0092B-C50C-407E-A947-70E740481C1C}">
+                                <a14:useLocalDpi xmlns:a14="http://schemas.microsoft.com/office/drawing/2010/main" val="0"/>
+                              </a:ext>
+                            </a:extLst>
+                          </a:blip>
+                          <a:srcRect/>
+                          <a:stretch>
+                            <a:fillRect/>
+                          </a:stretch>
+                        </pic:blipFill>
+                        <pic:spPr bwMode="auto">
+                          <a:xfrm>
+                            <a:off x="0" y="0"/>
+                            <a:ext cx="1930400" cy="1663700"/>
+                          </a:xfrm>
+                          <a:prstGeom prst="rect">
+                            <a:avLst/>
+                          </a:prstGeom>
+                          <a:noFill/>
+                          <a:ln>
+                            <a:noFill/>
+                          </a:ln>
+                        </pic:spPr>
+                      </pic:pic>
+                    </a:graphicData>
+                  </a:graphic>
+                </wp:inline>
+              </w:drawing>
+            </w:r>
           </w:p>
           <w:p>
             <w:pPr>
@@ -277,7 +264,7 @@
                 <w:sz w:val="20"/>
                 <w:szCs w:val="20"/>
               </w:rPr>
-              <w:t>Neo4j GraphRAG (N10S)■ ■ ■ ■ ■</w:t>
+              <w:t xml:space="preserve">Neo4j GraphRAG (N10S)■ ■ ■ </w:t>
             </w:r>
           </w:p>
           <w:p>
@@ -294,7 +281,7 @@
                 <w:sz w:val="20"/>
                 <w:szCs w:val="20"/>
               </w:rPr>
-              <w:t>Firebase Genkit/RAG  ■ ■ ■ ■ ■</w:t>
+              <w:t xml:space="preserve">Firebase Genkit/RAG  ■ ■ ■ ■ </w:t>
             </w:r>
           </w:p>
           <w:p>
@@ -319,7 +306,7 @@
                 <w:sz w:val="20"/>
                 <w:szCs w:val="20"/>
               </w:rPr>
-              <w:t>(BAEL 91)     ■ ■ ■ ■ ■</w:t>
+              <w:t xml:space="preserve">(BAEL 91)     ■ ■ ■ ■ </w:t>
             </w:r>
           </w:p>
           <w:p>
@@ -370,7 +357,7 @@
                 <w:sz w:val="20"/>
                 <w:szCs w:val="20"/>
               </w:rPr>
-              <w:t>Next.js 14 / React   ■ ■ ■ ■ □</w:t>
+              <w:t xml:space="preserve">Next.js 14 / React   ■ ■ ■ ■ </w:t>
             </w:r>
           </w:p>
           <w:p>
@@ -387,7 +374,7 @@
                 <w:sz w:val="20"/>
                 <w:szCs w:val="20"/>
               </w:rPr>
-              <w:t>FastAPI / Streamlit  ■ ■ ■ ■ ■</w:t>
+              <w:t xml:space="preserve">FastAPI / Streamlit  ■ ■ ■ ■ </w:t>
             </w:r>
           </w:p>
           <w:p>
@@ -404,7 +391,7 @@
                 <w:sz w:val="20"/>
                 <w:szCs w:val="20"/>
               </w:rPr>
-              <w:t>MLflow (MLOps)/Docker■ ■ ■ ■ □</w:t>
+              <w:t xml:space="preserve">MLflow (MLOps)/Docker■ ■ ■ </w:t>
             </w:r>
           </w:p>
           <w:p>
@@ -457,7 +444,15 @@
                 <w:sz w:val="20"/>
                 <w:szCs w:val="20"/>
               </w:rPr>
-              <w:t>Anglais    ■ ■ ■ ■ □  (Pro/Tech)</w:t>
+              <w:t xml:space="preserve">Anglais    ■ ■ ■ </w:t>
+            </w:r>
+            <w:r>
+              <w:rPr>
+                <w:color w:val="F8FAFC"/>
+                <w:sz w:val="20"/>
+                <w:szCs w:val="20"/>
+              </w:rPr>
+              <w:t xml:space="preserve"> □  (Pro/Tech)</w:t>
             </w:r>
           </w:p>
           <w:p>
@@ -957,8 +952,6 @@
               </w:rPr>
               <w:t xml:space="preserve"> hybride Google Gemma 4 12B local + Gemini 1.5 Pro + Python Sandbox (IfcOpenShell).</w:t>
             </w:r>
-            <w:bookmarkStart w:id="0" w:name="_GoBack"/>
-            <w:bookmarkEnd w:id="0"/>
           </w:p>
           <w:p>
             <w:pPr>
@@ -1739,7 +1732,112 @@
                 <w:sz w:val="20"/>
                 <w:szCs w:val="20"/>
               </w:rPr>
-              <w:t xml:space="preserve">Licence &amp; BTS Génie Civil (Option Bâtiment)  </w:t>
+              <w:t xml:space="preserve">BTS </w:t>
+            </w:r>
+            <w:proofErr w:type="spellStart"/>
+            <w:r>
+              <w:rPr>
+                <w:b/>
+                <w:color w:val="0A1128"/>
+                <w:sz w:val="20"/>
+                <w:szCs w:val="20"/>
+              </w:rPr>
+              <w:t>Génie</w:t>
+            </w:r>
+            <w:proofErr w:type="spellEnd"/>
+            <w:r>
+              <w:rPr>
+                <w:b/>
+                <w:color w:val="0A1128"/>
+                <w:sz w:val="20"/>
+                <w:szCs w:val="20"/>
+              </w:rPr>
+              <w:t xml:space="preserve"> &amp;</w:t>
+            </w:r>
+            <w:r>
+              <w:rPr>
+                <w:b/>
+                <w:color w:val="0A1128"/>
+                <w:sz w:val="20"/>
+                <w:szCs w:val="20"/>
+              </w:rPr>
+              <w:t xml:space="preserve"> </w:t>
+            </w:r>
+            <w:r>
+              <w:rPr>
+                <w:b/>
+                <w:color w:val="0A1128"/>
+                <w:sz w:val="20"/>
+                <w:szCs w:val="20"/>
+              </w:rPr>
+              <w:t>Civil</w:t>
+            </w:r>
+            <w:r>
+              <w:rPr>
+                <w:b/>
+                <w:color w:val="0A1128"/>
+                <w:sz w:val="20"/>
+                <w:szCs w:val="20"/>
+              </w:rPr>
+              <w:t xml:space="preserve"> </w:t>
+            </w:r>
+            <w:proofErr w:type="spellStart"/>
+            <w:r>
+              <w:rPr>
+                <w:b/>
+                <w:color w:val="0A1128"/>
+                <w:sz w:val="20"/>
+                <w:szCs w:val="20"/>
+              </w:rPr>
+              <w:t>Licence</w:t>
+            </w:r>
+            <w:proofErr w:type="spellEnd"/>
+            <w:r>
+              <w:rPr>
+                <w:b/>
+                <w:color w:val="0A1128"/>
+                <w:sz w:val="20"/>
+                <w:szCs w:val="20"/>
+              </w:rPr>
+              <w:t xml:space="preserve"> </w:t>
+            </w:r>
+            <w:r>
+              <w:rPr>
+                <w:b/>
+                <w:color w:val="0A1128"/>
+                <w:sz w:val="20"/>
+                <w:szCs w:val="20"/>
+              </w:rPr>
+              <w:t xml:space="preserve"> </w:t>
+            </w:r>
+            <w:r>
+              <w:rPr>
+                <w:b/>
+                <w:color w:val="0A1128"/>
+                <w:sz w:val="20"/>
+                <w:szCs w:val="20"/>
+              </w:rPr>
+              <w:t xml:space="preserve">(Option </w:t>
+            </w:r>
+            <w:proofErr w:type="spellStart"/>
+            <w:r>
+              <w:rPr>
+                <w:b/>
+                <w:color w:val="0A1128"/>
+                <w:sz w:val="20"/>
+                <w:szCs w:val="20"/>
+              </w:rPr>
+              <w:t>Bâtiment</w:t>
+            </w:r>
+            <w:proofErr w:type="spellEnd"/>
+            <w:r>
+              <w:rPr>
+                <w:b/>
+                <w:color w:val="0A1128"/>
+                <w:sz w:val="20"/>
+                <w:szCs w:val="20"/>
+              </w:rPr>
+              <w:t xml:space="preserve">)  </w:t>
             </w:r>
             <w:r>
               <w:rPr>
@@ -14391,7 +14489,7 @@
 </file>
 
 <file path=customXml/itemProps1.xml><?xml version="1.0" encoding="utf-8"?>
-<ds:datastoreItem xmlns:ds="http://schemas.openxmlformats.org/officeDocument/2006/customXml" ds:itemID="{2D38CA45-32DE-4E58-A9C2-7A4EAE5B3E6F}">
+<ds:datastoreItem xmlns:ds="http://schemas.openxmlformats.org/officeDocument/2006/customXml" ds:itemID="{F21FDEC3-35C4-4810-A53D-98396DBD7553}">
   <ds:schemaRefs>
     <ds:schemaRef ds:uri="http://schemas.openxmlformats.org/officeDocument/2006/bibliography"/>
   </ds:schemaRefs>

</xml_diff>

<commit_message>
feat: Link portfolio directly to official PDF and Word CV files (KOA_MARIE_GERVAIS_NELLY_CV_EXECUTIVE)
</commit_message>
<xml_diff>
--- a/KOA_MARIE_GERVAIS_NELLY_CV_EXECUTIVE.docx
+++ b/KOA_MARIE_GERVAIS_NELLY_CV_EXECUTIVE.docx
@@ -9,8 +9,8 @@
         <w:tblLook w:val="04A0" w:firstRow="1" w:lastRow="0" w:firstColumn="1" w:lastColumn="0" w:noHBand="0" w:noVBand="1"/>
       </w:tblPr>
       <w:tblGrid>
-        <w:gridCol w:w="3312"/>
-        <w:gridCol w:w="7728"/>
+        <w:gridCol w:w="3900"/>
+        <w:gridCol w:w="8103"/>
       </w:tblGrid>
       <w:tr>
         <w:trPr>
@@ -18,7 +18,7 @@
         </w:trPr>
         <w:tc>
           <w:tcPr>
-            <w:tcW w:w="3312" w:type="dxa"/>
+            <w:tcW w:w="3720" w:type="dxa"/>
             <w:shd w:val="clear" w:color="auto" w:fill="0F172A"/>
             <w:tcMar>
               <w:top w:w="100" w:type="dxa"/>
@@ -34,8 +34,6 @@
                 <w:szCs w:val="20"/>
               </w:rPr>
             </w:pPr>
-            <w:bookmarkStart w:id="0" w:name="_GoBack"/>
-            <w:bookmarkEnd w:id="0"/>
             <w:r>
               <w:rPr>
                 <w:b/>
@@ -47,8 +45,8 @@
               </w:rPr>
               <w:drawing>
                 <wp:inline distT="0" distB="0" distL="0" distR="0" wp14:anchorId="4B4CF01C" wp14:editId="61A43FE8">
-                  <wp:extent cx="1930400" cy="1663700"/>
-                  <wp:effectExtent l="0" t="0" r="0" b="0"/>
+                  <wp:extent cx="2324100" cy="1936750"/>
+                  <wp:effectExtent l="0" t="0" r="0" b="6350"/>
                   <wp:docPr id="1" name="Image 1" descr="C:\Users\HP\Downloads\Man_in_suit_headshot_202607251317.jpeg"/>
                   <wp:cNvGraphicFramePr>
                     <a:graphicFrameLocks xmlns:a="http://schemas.openxmlformats.org/drawingml/2006/main" noChangeAspect="1"/>
@@ -78,7 +76,7 @@
                         <pic:spPr bwMode="auto">
                           <a:xfrm>
                             <a:off x="0" y="0"/>
-                            <a:ext cx="1930400" cy="1663700"/>
+                            <a:ext cx="2324100" cy="1936750"/>
                           </a:xfrm>
                           <a:prstGeom prst="rect">
                             <a:avLst/>
@@ -631,7 +629,7 @@
         </w:tc>
         <w:tc>
           <w:tcPr>
-            <w:tcW w:w="7632" w:type="dxa"/>
+            <w:tcW w:w="8103" w:type="dxa"/>
             <w:shd w:val="clear" w:color="auto" w:fill="FFFFFF"/>
             <w:tcMar>
               <w:top w:w="100" w:type="dxa"/>
@@ -644,16 +642,16 @@
             <w:pPr>
               <w:spacing w:after="20"/>
               <w:rPr>
-                <w:sz w:val="20"/>
-                <w:szCs w:val="20"/>
+                <w:sz w:val="26"/>
+                <w:szCs w:val="26"/>
               </w:rPr>
             </w:pPr>
             <w:r>
               <w:rPr>
                 <w:b/>
                 <w:color w:val="0A1128"/>
-                <w:sz w:val="20"/>
-                <w:szCs w:val="20"/>
+                <w:sz w:val="26"/>
+                <w:szCs w:val="26"/>
               </w:rPr>
               <w:t>KOA MARIE GERVAIS NELLY</w:t>
             </w:r>
@@ -662,16 +660,16 @@
             <w:pPr>
               <w:spacing w:after="20"/>
               <w:rPr>
-                <w:sz w:val="20"/>
-                <w:szCs w:val="20"/>
+                <w:sz w:val="24"/>
+                <w:szCs w:val="24"/>
               </w:rPr>
             </w:pPr>
             <w:r>
               <w:rPr>
                 <w:b/>
                 <w:color w:val="0284C7"/>
-                <w:sz w:val="20"/>
-                <w:szCs w:val="20"/>
+                <w:sz w:val="24"/>
+                <w:szCs w:val="24"/>
               </w:rPr>
               <w:t>Lead AI Engineer &amp; Consultant IA / Data   │   Fondateur @ Archi Cam AI</w:t>
             </w:r>
@@ -680,15 +678,15 @@
             <w:pPr>
               <w:spacing w:after="60"/>
               <w:rPr>
-                <w:sz w:val="20"/>
-                <w:szCs w:val="20"/>
+                <w:sz w:val="21"/>
+                <w:szCs w:val="21"/>
               </w:rPr>
             </w:pPr>
             <w:r>
               <w:rPr>
                 <w:color w:val="0284C7"/>
-                <w:sz w:val="20"/>
-                <w:szCs w:val="20"/>
+                <w:sz w:val="21"/>
+                <w:szCs w:val="21"/>
               </w:rPr>
               <w:t>─── ◈ ────────────────────────────────────────────────────────── ◈ ───</w:t>
             </w:r>
@@ -742,7 +740,25 @@
                 <w:sz w:val="20"/>
                 <w:szCs w:val="20"/>
               </w:rPr>
-              <w:t xml:space="preserve">la transformation de leurs données complexes en </w:t>
+              <w:t xml:space="preserve">la transformation de leurs </w:t>
+            </w:r>
+            <w:proofErr w:type="spellStart"/>
+            <w:r>
+              <w:rPr>
+                <w:color w:val="334155"/>
+                <w:sz w:val="20"/>
+                <w:szCs w:val="20"/>
+              </w:rPr>
+              <w:t>données</w:t>
+            </w:r>
+            <w:proofErr w:type="spellEnd"/>
+            <w:r>
+              <w:rPr>
+                <w:color w:val="334155"/>
+                <w:sz w:val="20"/>
+                <w:szCs w:val="20"/>
+              </w:rPr>
+              <w:t xml:space="preserve"> complexes en </w:t>
             </w:r>
             <w:proofErr w:type="gramStart"/>
             <w:r>
@@ -760,7 +776,25 @@
                 <w:sz w:val="20"/>
                 <w:szCs w:val="20"/>
               </w:rPr>
-              <w:t xml:space="preserve"> décisionnels à forte valeur ajoutée. Spécialiste des Agents IA autonomes, du GraphRAG (Neo4j N10S) et de la Business Intelligence sécurisée (Sovereign.BI), je développe des solutions d'IA souveraines,</w:t>
+              <w:t xml:space="preserve"> </w:t>
+            </w:r>
+            <w:proofErr w:type="spellStart"/>
+            <w:r>
+              <w:rPr>
+                <w:color w:val="334155"/>
+                <w:sz w:val="20"/>
+                <w:szCs w:val="20"/>
+              </w:rPr>
+              <w:t>décisionnels</w:t>
+            </w:r>
+            <w:proofErr w:type="spellEnd"/>
+            <w:r>
+              <w:rPr>
+                <w:color w:val="334155"/>
+                <w:sz w:val="20"/>
+                <w:szCs w:val="20"/>
+              </w:rPr>
+              <w:t xml:space="preserve"> à forte valeur ajoutée. Spécialiste des Agents IA autonomes, du GraphRAG (Neo4j N10S) et de la Business Intelligence sécurisée (Sovereign.BI), je développe des solutions d'IA souveraines,</w:t>
             </w:r>
             <w:r>
               <w:rPr>
@@ -1867,6 +1901,8 @@
             </w:r>
           </w:p>
         </w:tc>
+        <w:bookmarkStart w:id="0" w:name="_GoBack"/>
+        <w:bookmarkEnd w:id="0"/>
       </w:tr>
     </w:tbl>
     <w:p>
@@ -14161,6 +14197,36 @@
       </w:tcPr>
     </w:tblStylePr>
   </w:style>
+  <w:style w:type="paragraph" w:styleId="Textedebulles">
+    <w:name w:val="Balloon Text"/>
+    <w:basedOn w:val="Normal"/>
+    <w:link w:val="TextedebullesCar"/>
+    <w:uiPriority w:val="99"/>
+    <w:semiHidden/>
+    <w:unhideWhenUsed/>
+    <w:rsid w:val="00CA1EA4"/>
+    <w:pPr>
+      <w:spacing w:after="0" w:line="240" w:lineRule="auto"/>
+    </w:pPr>
+    <w:rPr>
+      <w:rFonts w:cs="Segoe UI"/>
+      <w:sz w:val="18"/>
+      <w:szCs w:val="18"/>
+    </w:rPr>
+  </w:style>
+  <w:style w:type="character" w:customStyle="1" w:styleId="TextedebullesCar">
+    <w:name w:val="Texte de bulles Car"/>
+    <w:basedOn w:val="Policepardfaut"/>
+    <w:link w:val="Textedebulles"/>
+    <w:uiPriority w:val="99"/>
+    <w:semiHidden/>
+    <w:rsid w:val="00CA1EA4"/>
+    <w:rPr>
+      <w:rFonts w:ascii="Segoe UI" w:hAnsi="Segoe UI" w:cs="Segoe UI"/>
+      <w:sz w:val="18"/>
+      <w:szCs w:val="18"/>
+    </w:rPr>
+  </w:style>
 </w:styles>
 </file>
 
@@ -14489,7 +14555,7 @@
 </file>
 
 <file path=customXml/itemProps1.xml><?xml version="1.0" encoding="utf-8"?>
-<ds:datastoreItem xmlns:ds="http://schemas.openxmlformats.org/officeDocument/2006/customXml" ds:itemID="{F21FDEC3-35C4-4810-A53D-98396DBD7553}">
+<ds:datastoreItem xmlns:ds="http://schemas.openxmlformats.org/officeDocument/2006/customXml" ds:itemID="{3767E140-4324-4912-84BE-1AC3BE4490A9}">
   <ds:schemaRefs>
     <ds:schemaRef ds:uri="http://schemas.openxmlformats.org/officeDocument/2006/bibliography"/>
   </ds:schemaRefs>

</xml_diff>